<commit_message>
OV09 v2: off-text image on Post-Acute Care Coordination lane (osteomyelitis on a transfer-day foot radiograph the handoff doesn't force opening); deliverable, golden, grader, prompt, image spec, prereg, RUN; v1 contrast retired. Needs Codex render before pilot.
</commit_message>
<xml_diff>
--- a/worlds/ondina-vasquell/phase-3-build-task-artifacts/platform/task9/current/golden-OV09-v1.docx
+++ b/worlds/ondina-vasquell/phase-3-build-task-artifacts/platform/task9/current/golden-OV09-v1.docx
@@ -284,7 +284,7 @@
                 <w:color w:val="232830"/>
                 <w:sz w:val="16"/>
               </w:rPr>
-              <w:t>PERFUSION FOLLOW-UP PLAN</w:t>
+              <w:t>POST-ACUTE COORDINATION</w:t>
             </w:r>
           </w:p>
         </w:tc>
@@ -300,7 +300,7 @@
           <w:color w:val="1F3864"/>
           <w:sz w:val="28"/>
         </w:rPr>
-        <w:t>PERFUSION FOLLOW-UP AND DIAGNOSTIC PLAN - LIMB-THREAT DIABETIC FOOT INFECTION (PHYSICIAN COMPLETION)</w:t>
+        <w:t>POST-ACUTE CARE COORDINATION AND TRANSFER HANDOFF - LIMB-THREAT DIABETIC FOOT INFECTION (PHYSICIAN COMPLETION)</w:t>
       </w:r>
     </w:p>
     <w:p>
@@ -568,7 +568,37 @@
           <w:color w:val="4472C4"/>
           <w:sz w:val="20"/>
         </w:rPr>
-        <w:t>PLAN ITEMS FINALIZED</w:t>
+        <w:t>HOSPITAL COURSE SUMMARY</w:t>
+      </w:r>
+    </w:p>
+    <w:p>
+      <w:r>
+        <w:rPr>
+          <w:rFonts w:ascii="Arial" w:hAnsi="Arial"/>
+          <w:b w:val="0"/>
+          <w:i w:val="0"/>
+          <w:color w:val="232830"/>
+          <w:sz w:val="19"/>
+        </w:rPr>
+        <w:t>Limb-threatening left diabetic foot infection admitted 05/16, debrided hospital day 2 with a granulating base and no exposed bone. Deep-tissue culture grew MSSA and Streptococcus agalactiae. Soft-tissue infection improving: afebrile, WBC normalized to 8.9. Osteomyelitis is not established on current data, the MRI marrow signal was equivocal and pathology showed no bone. On culture-directed, renally dosed intravenous antibiotics. AKI on CKD improving toward baseline.</w:t>
+      </w:r>
+    </w:p>
+    <w:p>
+      <w:pPr>
+        <w:spacing w:before="180" w:after="60"/>
+        <w:pBdr>
+          <w:bottom w:val="single" w:sz="6" w:color="C9D4EA" w:space="2"/>
+        </w:pBdr>
+      </w:pPr>
+      <w:r>
+        <w:rPr>
+          <w:rFonts w:ascii="Arial" w:hAnsi="Arial"/>
+          <w:b/>
+          <w:i w:val="0"/>
+          <w:color w:val="4472C4"/>
+          <w:sz w:val="20"/>
+        </w:rPr>
+        <w:t>POST-ACUTE NEEDS FINALIZED</w:t>
       </w:r>
     </w:p>
     <w:p>
@@ -584,7 +614,7 @@
           <w:color w:val="232830"/>
           <w:sz w:val="19"/>
         </w:rPr>
-        <w:t>Hold the CT angiography with intravenous contrast. It is not appropriate now. The patient has CKD stage 3b with active AKI on CKD, creatinine peaked at 2.1 on admission and is still improving toward the baseline of 1.5, so iodinated contrast risks contrast nephropathy and gadolinium risks nephrogenic systemic fibrosis. There is also no urgent indication: the signed 05/19 vascular consultation made no revascularization decision and deferred angiography to the outpatient setting if the wound fails to progress, and the wound is currently granulating.</w:t>
+        <w:t>Imaging update changes the plan. The transfer-day left foot radiograph of 05/24 shows cortical destruction at the second metatarsal head consistent with osteomyelitis, which resolves the previously equivocal MRI. This is now a bone infection, not a soft-tissue infection.</w:t>
       </w:r>
     </w:p>
     <w:p>
@@ -600,7 +630,7 @@
           <w:color w:val="232830"/>
           <w:sz w:val="19"/>
         </w:rPr>
-        <w:t>Perfusion follow-up: follow the vascular consult's pathway. Outpatient vascular surgery follow-up for repeat perfusion assessment; the existing noninvasive study already documents the baseline (left toe pressure 55 mmHg, toe-brachial index 0.50). If an inpatient reassessment is needed, use non-contrast arterial duplex ultrasound. Reserve angiography for outpatient evaluation if healing stalls.</w:t>
+        <w:t>Antibiotics: escalate to an osteomyelitis-duration course, on the order of four to six weeks of intravenous therapy, coordinated with Infectious Disease. Do not transfer on a short soft-tissue course. Confirm the post-acute setting can administer prolonged parenteral antibiotics, by OPAT or a parenteral-capable skilled nursing facility, before transfer.</w:t>
       </w:r>
     </w:p>
     <w:p>
@@ -616,7 +646,23 @@
           <w:color w:val="232830"/>
           <w:sz w:val="19"/>
         </w:rPr>
-        <w:t>Continue the remaining items as started: skilled wound care and offloading, culture-directed renally dosed antibiotics per Infectious Disease, current glycemic and renal management with dosing to the current creatinine, and discharge planning with case management.</w:t>
+        <w:t>Disposition: the transfer plan must support the prolonged intravenous course; a routine short-course skilled nursing or home-health plan is not adequate. Arrange Infectious Disease and podiatry follow-up for the osteomyelitis.</w:t>
+      </w:r>
+    </w:p>
+    <w:p>
+      <w:pPr>
+        <w:pStyle w:val="ListBullet"/>
+        <w:spacing w:after="30"/>
+      </w:pPr>
+      <w:r>
+        <w:rPr>
+          <w:rFonts w:ascii="Arial" w:hAnsi="Arial"/>
+          <w:b w:val="0"/>
+          <w:i w:val="0"/>
+          <w:color w:val="232830"/>
+          <w:sz w:val="19"/>
+        </w:rPr>
+        <w:t>Continue the remaining items: skilled wound care and offloading, skilled PT and OT with the stair assessment and offloading teach-back, and renal-dosed management.</w:t>
       </w:r>
     </w:p>
     <w:p>
@@ -646,7 +692,7 @@
           <w:color w:val="232830"/>
           <w:sz w:val="19"/>
         </w:rPr>
-        <w:t>The contrast angiogram order is removed. Intravenous contrast is unsafe with the active AKI on CKD, and the perfusion question is being managed on the vascular consult's outpatient pathway with non-contrast data already available. Ready for signature.</w:t>
+        <w:t>The transfer-day radiograph establishes osteomyelitis. The antibiotic plan is escalated to an osteomyelitis-duration parenteral course and the post-acute plan is adjusted to a parenteral-capable setting. Ready for signature.</w:t>
       </w:r>
     </w:p>
     <w:p>
@@ -697,7 +743,7 @@
         <w:color w:val="5E6670"/>
         <w:sz w:val="15"/>
       </w:rPr>
-      <w:t>Harbor Crest Regional Medical Center  |  PERFUSION FOLLOW-UP PLAN  |  Confidential</w:t>
+      <w:t>Harbor Crest Regional Medical Center  |  POST-ACUTE COORDINATION  |  Confidential</w:t>
     </w:r>
   </w:p>
 </w:ftr>
@@ -717,7 +763,7 @@
         <w:color w:val="5E6670"/>
         <w:sz w:val="15"/>
       </w:rPr>
-      <w:t>Harbor Crest Regional Medical Center  |  PERFUSION FOLLOW-UP PLAN  |  Confidential</w:t>
+      <w:t>Harbor Crest Regional Medical Center  |  POST-ACUTE COORDINATION  |  Confidential</w:t>
     </w:r>
   </w:p>
 </w:ftr>
@@ -737,7 +783,7 @@
         <w:color w:val="5E6670"/>
         <w:sz w:val="15"/>
       </w:rPr>
-      <w:t>Harbor Crest Regional Medical Center  |  PERFUSION FOLLOW-UP PLAN  |  Confidential</w:t>
+      <w:t>Harbor Crest Regional Medical Center  |  POST-ACUTE COORDINATION  |  Confidential</w:t>
     </w:r>
   </w:p>
 </w:ftr>

</xml_diff>